<commit_message>
feat: add resume files and configure index.html with title and analytics script
</commit_message>
<xml_diff>
--- a/public/K-Karthikeyan.docx
+++ b/public/K-Karthikeyan.docx
@@ -8,33 +8,43 @@
         <w:ind w:left="0" w:firstLine="0"/>
         <w:jc w:val="both"/>
       </w:pPr>
-      <w:hyperlink r:id="rId6" w:history="1">
-        <w:r>
-          <w:rPr>
-            <w:rStyle w:val="Hyperlink"/>
-            <w:b/>
-            <w:sz w:val="40"/>
-            <w:szCs w:val="28"/>
-            <w:u w:val="none"/>
-          </w:rPr>
-          <w:t>KARTHIKEYAN K</w:t>
-        </w:r>
-        <w:r>
-          <w:rPr>
-            <w:rStyle w:val="Hyperlink"/>
-            <w:b/>
-            <w:sz w:val="40"/>
-            <w:szCs w:val="28"/>
-            <w:u w:val="none"/>
-          </w:rPr>
-          <w:t xml:space="preserve">             </w:t>
-        </w:r>
-      </w:hyperlink>
-      <w:r>
-        <w:rPr>
+      <w:r>
+        <w:fldChar w:fldCharType="begin"/>
+      </w:r>
+      <w:r>
+        <w:instrText>HYPERLINK "https://kkarthik3.github.io/"</w:instrText>
+      </w:r>
+      <w:r>
+        <w:fldChar w:fldCharType="separate"/>
+      </w:r>
+      <w:r>
+        <w:rPr>
+          <w:rStyle w:val="Hyperlink"/>
           <w:b/>
           <w:sz w:val="40"/>
           <w:szCs w:val="28"/>
+          <w:u w:val="none"/>
+        </w:rPr>
+        <w:t>KARTHIKEYAN K</w:t>
+      </w:r>
+      <w:r>
+        <w:rPr>
+          <w:rStyle w:val="Hyperlink"/>
+          <w:b/>
+          <w:sz w:val="40"/>
+          <w:szCs w:val="28"/>
+          <w:u w:val="none"/>
+        </w:rPr>
+        <w:t xml:space="preserve">             </w:t>
+      </w:r>
+      <w:r>
+        <w:fldChar w:fldCharType="end"/>
+      </w:r>
+      <w:r>
+        <w:rPr>
+          <w:b/>
+          <w:sz w:val="40"/>
+          <w:szCs w:val="28"/>
         </w:rPr>
         <w:t xml:space="preserve"> </w:t>
       </w:r>
@@ -54,6 +64,7 @@
         </w:rPr>
         <w:tab/>
       </w:r>
+      <w:proofErr w:type="gramStart"/>
       <w:r>
         <w:rPr>
           <w:b/>
@@ -70,6 +81,7 @@
         </w:rPr>
         <w:t>|</w:t>
       </w:r>
+      <w:proofErr w:type="gramEnd"/>
       <w:r>
         <w:rPr>
           <w:b/>
@@ -102,7 +114,7 @@
         </w:rPr>
         <w:t>|</w:t>
       </w:r>
-      <w:hyperlink r:id="rId7" w:history="1">
+      <w:hyperlink r:id="rId6" w:history="1">
         <w:r>
           <w:rPr>
             <w:rStyle w:val="Hyperlink"/>
@@ -183,6 +195,48 @@
         </w:rPr>
         <w:t xml:space="preserve"> </w:t>
       </w:r>
+      <w:hyperlink r:id="rId7" w:history="1">
+        <w:proofErr w:type="spellStart"/>
+        <w:r>
+          <w:rPr>
+            <w:rStyle w:val="Hyperlink"/>
+            <w:b/>
+            <w:szCs w:val="24"/>
+          </w:rPr>
+          <w:t>Github</w:t>
+        </w:r>
+        <w:proofErr w:type="spellEnd"/>
+        <w:r>
+          <w:rPr>
+            <w:rStyle w:val="Hyperlink"/>
+            <w:b/>
+            <w:szCs w:val="24"/>
+          </w:rPr>
+          <w:t>/kkarthik3</w:t>
+        </w:r>
+      </w:hyperlink>
+      <w:r>
+        <w:rPr>
+          <w:rStyle w:val="Hyperlink"/>
+          <w:b/>
+          <w:szCs w:val="24"/>
+        </w:rPr>
+        <w:t xml:space="preserve"> </w:t>
+      </w:r>
+      <w:r>
+        <w:rPr>
+          <w:b/>
+          <w:szCs w:val="24"/>
+        </w:rPr>
+        <w:t>|</w:t>
+      </w:r>
+      <w:r>
+        <w:rPr>
+          <w:b/>
+          <w:szCs w:val="24"/>
+        </w:rPr>
+        <w:t xml:space="preserve"> </w:t>
+      </w:r>
       <w:hyperlink r:id="rId8" w:history="1">
         <w:r>
           <w:rPr>
@@ -190,39 +244,25 @@
             <w:b/>
             <w:szCs w:val="24"/>
           </w:rPr>
-          <w:t>Github/kkarthik3</w:t>
+          <w:t>LinkedIn/</w:t>
         </w:r>
-      </w:hyperlink>
-      <w:r>
-        <w:rPr>
-          <w:rStyle w:val="Hyperlink"/>
-          <w:b/>
-          <w:szCs w:val="24"/>
-        </w:rPr>
-        <w:t xml:space="preserve"> </w:t>
-      </w:r>
-      <w:r>
-        <w:rPr>
-          <w:b/>
-          <w:szCs w:val="24"/>
-        </w:rPr>
-        <w:t>|</w:t>
-      </w:r>
-      <w:r>
-        <w:rPr>
-          <w:b/>
-          <w:szCs w:val="24"/>
-        </w:rPr>
-        <w:t xml:space="preserve"> </w:t>
-      </w:r>
-      <w:hyperlink r:id="rId9" w:history="1">
+        <w:proofErr w:type="spellStart"/>
         <w:r>
           <w:rPr>
             <w:rStyle w:val="Hyperlink"/>
             <w:b/>
             <w:szCs w:val="24"/>
           </w:rPr>
-          <w:t>LinkedIn/kkarthick-k</w:t>
+          <w:t>kkarthick</w:t>
+        </w:r>
+        <w:proofErr w:type="spellEnd"/>
+        <w:r>
+          <w:rPr>
+            <w:rStyle w:val="Hyperlink"/>
+            <w:b/>
+            <w:szCs w:val="24"/>
+          </w:rPr>
+          <w:t>-k</w:t>
         </w:r>
       </w:hyperlink>
       <w:r>
@@ -240,7 +280,7 @@
         </w:rPr>
         <w:t>|</w:t>
       </w:r>
-      <w:hyperlink r:id="rId10" w:history="1">
+      <w:hyperlink r:id="rId9" w:history="1">
         <w:r>
           <w:rPr>
             <w:rStyle w:val="Hyperlink"/>
@@ -257,14 +297,24 @@
         </w:rPr>
         <w:t xml:space="preserve">| </w:t>
       </w:r>
-      <w:hyperlink r:id="rId11" w:history="1">
+      <w:hyperlink r:id="rId10" w:history="1">
+        <w:proofErr w:type="spellStart"/>
         <w:r>
           <w:rPr>
             <w:rStyle w:val="Hyperlink"/>
             <w:b/>
             <w:szCs w:val="24"/>
           </w:rPr>
-          <w:t>kaggle/kk3103</w:t>
+          <w:t>kaggle</w:t>
+        </w:r>
+        <w:proofErr w:type="spellEnd"/>
+        <w:r>
+          <w:rPr>
+            <w:rStyle w:val="Hyperlink"/>
+            <w:b/>
+            <w:szCs w:val="24"/>
+          </w:rPr>
+          <w:t>/kk3103</w:t>
         </w:r>
       </w:hyperlink>
       <w:r>
@@ -316,7 +366,7 @@
                 <wp:cNvGraphicFramePr/>
                 <a:graphic xmlns:a="http://schemas.openxmlformats.org/drawingml/2006/main">
                   <a:graphicData uri="http://schemas.microsoft.com/office/word/2010/wordprocessingInk">
-                    <w14:contentPart bwMode="auto" r:id="rId12">
+                    <w14:contentPart bwMode="auto" r:id="rId11">
                       <w14:nvContentPartPr>
                         <w14:cNvContentPartPr/>
                       </w14:nvContentPartPr>
@@ -377,7 +427,55 @@
           <w:bCs/>
           <w:szCs w:val="24"/>
         </w:rPr>
-        <w:t xml:space="preserve">Machine Learning Engineer with 2.5 years of professional experience, including 1.5 years in AI/ML and 1 year in data operations. Experienced in designing and deploying RAG-based chatbots, vector search engines, and real-time computer vision systems using LangChain, LangGraph, Neo4j, FastAPI, and cloud platforms such as AWS and Kubernetes. Skilled in data preprocessing, model development, and scalable deployment, delivering production-ready AI solutions that drive efficiency and improve user experiences across bioinformatics, e-commerce, and </w:t>
+        <w:t xml:space="preserve">Machine Learning Engineer with 2.5 years of professional experience, including 1.5 years in AI/ML and 1 year in data operations. Experienced in designing and deploying RAG-based chatbots, vector search engines, and real-time computer vision systems using </w:t>
+      </w:r>
+      <w:proofErr w:type="spellStart"/>
+      <w:r>
+        <w:rPr>
+          <w:bCs/>
+          <w:szCs w:val="24"/>
+        </w:rPr>
+        <w:t>LangChain</w:t>
+      </w:r>
+      <w:proofErr w:type="spellEnd"/>
+      <w:r>
+        <w:rPr>
+          <w:bCs/>
+          <w:szCs w:val="24"/>
+        </w:rPr>
+        <w:t xml:space="preserve">, </w:t>
+      </w:r>
+      <w:proofErr w:type="spellStart"/>
+      <w:r>
+        <w:rPr>
+          <w:bCs/>
+          <w:szCs w:val="24"/>
+        </w:rPr>
+        <w:t>LangGraph</w:t>
+      </w:r>
+      <w:proofErr w:type="spellEnd"/>
+      <w:r>
+        <w:rPr>
+          <w:bCs/>
+          <w:szCs w:val="24"/>
+        </w:rPr>
+        <w:t xml:space="preserve">, Neo4j, </w:t>
+      </w:r>
+      <w:proofErr w:type="spellStart"/>
+      <w:r>
+        <w:rPr>
+          <w:bCs/>
+          <w:szCs w:val="24"/>
+        </w:rPr>
+        <w:t>FastAPI</w:t>
+      </w:r>
+      <w:proofErr w:type="spellEnd"/>
+      <w:r>
+        <w:rPr>
+          <w:bCs/>
+          <w:szCs w:val="24"/>
+        </w:rPr>
+        <w:t xml:space="preserve">, and cloud platforms such as AWS and Kubernetes. Skilled in data preprocessing, model development, and scalable deployment, delivering production-ready AI solutions that drive efficiency and improve user experiences across bioinformatics, e-commerce, and </w:t>
       </w:r>
       <w:r>
         <w:rPr>
@@ -492,7 +590,14 @@
         <w:rPr>
           <w:b/>
         </w:rPr>
-        <w:t>Machine Learning Engineer</w:t>
+        <w:t xml:space="preserve">Machine Learning </w:t>
+      </w:r>
+      <w:proofErr w:type="gramStart"/>
+      <w:r>
+        <w:rPr>
+          <w:b/>
+        </w:rPr>
+        <w:t>Engineer</w:t>
       </w:r>
       <w:r>
         <w:rPr>
@@ -500,26 +605,51 @@
         </w:rPr>
         <w:t>[</w:t>
       </w:r>
-      <w:hyperlink r:id="rId16" w:history="1">
-        <w:r>
-          <w:rPr>
-            <w:rStyle w:val="Hyperlink"/>
-          </w:rPr>
-          <w:t>Ka</w:t>
-        </w:r>
-        <w:r>
-          <w:rPr>
-            <w:rStyle w:val="Hyperlink"/>
-          </w:rPr>
-          <w:t>d</w:t>
-        </w:r>
-        <w:r>
-          <w:rPr>
-            <w:rStyle w:val="Hyperlink"/>
-          </w:rPr>
-          <w:t>it Innovations, Tenkasi, India</w:t>
-        </w:r>
-      </w:hyperlink>
+      <w:proofErr w:type="gramEnd"/>
+      <w:r>
+        <w:fldChar w:fldCharType="begin"/>
+      </w:r>
+      <w:r>
+        <w:instrText>HYPERLINK "https://kaditinnovations.com/"</w:instrText>
+      </w:r>
+      <w:r>
+        <w:fldChar w:fldCharType="separate"/>
+      </w:r>
+      <w:r>
+        <w:rPr>
+          <w:rStyle w:val="Hyperlink"/>
+        </w:rPr>
+        <w:t>Ka</w:t>
+      </w:r>
+      <w:r>
+        <w:rPr>
+          <w:rStyle w:val="Hyperlink"/>
+        </w:rPr>
+        <w:t>d</w:t>
+      </w:r>
+      <w:r>
+        <w:rPr>
+          <w:rStyle w:val="Hyperlink"/>
+        </w:rPr>
+        <w:t xml:space="preserve">it Innovations, </w:t>
+      </w:r>
+      <w:proofErr w:type="spellStart"/>
+      <w:r>
+        <w:rPr>
+          <w:rStyle w:val="Hyperlink"/>
+        </w:rPr>
+        <w:t>Tenkasi</w:t>
+      </w:r>
+      <w:proofErr w:type="spellEnd"/>
+      <w:r>
+        <w:rPr>
+          <w:rStyle w:val="Hyperlink"/>
+        </w:rPr>
+        <w:t>, India</w:t>
+      </w:r>
+      <w:r>
+        <w:fldChar w:fldCharType="end"/>
+      </w:r>
       <w:r>
         <w:rPr>
           <w:bCs/>
@@ -548,7 +678,23 @@
           <w:b/>
           <w:bCs/>
         </w:rPr>
-        <w:t xml:space="preserve"> Protein Vector Search : </w:t>
+        <w:t xml:space="preserve"> Protein Vector </w:t>
+      </w:r>
+      <w:proofErr w:type="gramStart"/>
+      <w:r>
+        <w:rPr>
+          <w:b/>
+          <w:bCs/>
+        </w:rPr>
+        <w:t>Search :</w:t>
+      </w:r>
+      <w:proofErr w:type="gramEnd"/>
+      <w:r>
+        <w:rPr>
+          <w:b/>
+          <w:bCs/>
+        </w:rPr>
+        <w:t xml:space="preserve"> </w:t>
       </w:r>
       <w:r>
         <w:t>Designed and implemented an AI-powered protein search engine using Neo4j vector databases to perform similarity-based retrieval, integrating metadata from multiple protein databases to map sequences and identify relevant matches, including detailed annotation of post-translational modifications (PTMs).</w:t>
@@ -572,7 +718,15 @@
         <w:t>CCTV Attendance Monitoring System</w:t>
       </w:r>
       <w:r>
-        <w:t>: Built a real-time attendance and security monitoring solution using RTSP camera feeds with on-device motion detection. Integrated WebSocket triggers to capture events, applied YOLO for person detection and InsightFace facial embeddings for identity recognition, and logged verified entries into PostgreSQL for attendance tracking and auditing.</w:t>
+        <w:t xml:space="preserve">: Built a real-time attendance and security monitoring solution using RTSP camera feeds with on-device motion detection. Integrated WebSocket triggers to capture events, applied YOLO for person detection and </w:t>
+      </w:r>
+      <w:proofErr w:type="spellStart"/>
+      <w:r>
+        <w:t>InsightFace</w:t>
+      </w:r>
+      <w:proofErr w:type="spellEnd"/>
+      <w:r>
+        <w:t xml:space="preserve"> facial embeddings for identity recognition, and logged verified entries into PostgreSQL for attendance tracking and auditing.</w:t>
       </w:r>
     </w:p>
     <w:p>
@@ -586,144 +740,7 @@
         <w:jc w:val="both"/>
       </w:pPr>
       <w:r>
-        <w:t>Deployed the application</w:t>
-      </w:r>
-      <w:r>
-        <w:t>s</w:t>
-      </w:r>
-      <w:r>
-        <w:t xml:space="preserve"> on AWS, leveraging services such as EC2, S3,</w:t>
-      </w:r>
-      <w:r>
-        <w:t xml:space="preserve"> EKS</w:t>
-      </w:r>
-      <w:r>
-        <w:t xml:space="preserve"> and Lambda to ensure scalable performance and reliability for processing large biological datasets in a cloud-native environment.</w:t>
-      </w:r>
-    </w:p>
-    <w:p>
-      <w:pPr>
-        <w:spacing w:after="0" w:line="259" w:lineRule="auto"/>
-        <w:ind w:left="2127" w:hanging="2127"/>
-        <w:jc w:val="both"/>
-        <w:rPr>
-          <w:b/>
-        </w:rPr>
-      </w:pPr>
-      <w:r>
-        <w:rPr>
-          <w:b/>
-        </w:rPr>
-        <w:t>Associate Machine Learning Engineer</w:t>
-      </w:r>
-      <w:r>
-        <w:rPr>
-          <w:b/>
-        </w:rPr>
-        <w:t xml:space="preserve"> </w:t>
-      </w:r>
-      <w:r>
-        <w:rPr>
-          <w:bCs/>
-        </w:rPr>
-        <w:t>[</w:t>
-      </w:r>
-      <w:hyperlink r:id="rId17" w:history="1">
-        <w:r>
-          <w:rPr>
-            <w:rStyle w:val="Hyperlink"/>
-            <w:bCs/>
-          </w:rPr>
-          <w:t>ISPG Technologies Pvt.Ltd, Kochin, Kerala</w:t>
-        </w:r>
-      </w:hyperlink>
-      <w:r>
-        <w:rPr>
-          <w:bCs/>
-        </w:rPr>
-        <w:t>]</w:t>
-      </w:r>
-      <w:r>
-        <w:rPr>
-          <w:b/>
-        </w:rPr>
-        <w:t xml:space="preserve">                             Dec 2024 – </w:t>
-      </w:r>
-      <w:r>
-        <w:rPr>
-          <w:b/>
-        </w:rPr>
-        <w:t>Mar 2025</w:t>
-      </w:r>
-    </w:p>
-    <w:p>
-      <w:pPr>
-        <w:spacing w:after="0" w:line="259" w:lineRule="auto"/>
-        <w:ind w:left="2127" w:hanging="2127"/>
-        <w:jc w:val="both"/>
-        <w:rPr>
-          <w:b/>
-          <w:bCs/>
-          <w:i/>
-          <w:iCs/>
-          <w:sz w:val="20"/>
-          <w:szCs w:val="20"/>
-        </w:rPr>
-      </w:pPr>
-      <w:r>
-        <w:rPr>
-          <w:b/>
-          <w:bCs/>
-          <w:i/>
-          <w:iCs/>
-          <w:sz w:val="20"/>
-          <w:szCs w:val="20"/>
-        </w:rPr>
-        <w:t>(Intern</w:t>
-      </w:r>
-      <w:r>
-        <w:rPr>
-          <w:b/>
-          <w:bCs/>
-          <w:i/>
-          <w:iCs/>
-          <w:sz w:val="20"/>
-          <w:szCs w:val="20"/>
-        </w:rPr>
-        <w:t>: 7 Months</w:t>
-      </w:r>
-      <w:r>
-        <w:rPr>
-          <w:b/>
-          <w:bCs/>
-          <w:i/>
-          <w:iCs/>
-          <w:sz w:val="20"/>
-          <w:szCs w:val="20"/>
-        </w:rPr>
-        <w:t xml:space="preserve"> → Associate ML Engineer</w:t>
-      </w:r>
-      <w:r>
-        <w:rPr>
-          <w:b/>
-          <w:bCs/>
-          <w:i/>
-          <w:iCs/>
-          <w:sz w:val="20"/>
-          <w:szCs w:val="20"/>
-        </w:rPr>
-        <w:t>: 3 Months</w:t>
-      </w:r>
-      <w:r>
-        <w:rPr>
-          <w:b/>
-          <w:bCs/>
-          <w:i/>
-          <w:iCs/>
-          <w:sz w:val="20"/>
-          <w:szCs w:val="20"/>
-        </w:rPr>
-        <w:t>)</w:t>
+        <w:t>Deployed a Kubeflow pipeline for fine-tuning a large language model, and published the model to both GCP AI Repository and Hugging Face for production-ready access.</w:t>
       </w:r>
     </w:p>
     <w:p>
@@ -737,14 +754,160 @@
         <w:jc w:val="both"/>
       </w:pPr>
       <w:r>
-        <w:rPr>
-          <w:b/>
-          <w:bCs/>
-        </w:rPr>
-        <w:t>RAG-Based Product User-Manual Chatbot (Development)</w:t>
-      </w:r>
-      <w:r>
-        <w:t>: Created a RAG-based product manual chatbot API by crawling and scraping over 5000 websites using Selenium, stored embeddings in Mongo-VectorSearch, and structured the workflow using LangGraph with tools and agents for particular sections.</w:t>
+        <w:t>Deployed the application</w:t>
+      </w:r>
+      <w:r>
+        <w:t>s</w:t>
+      </w:r>
+      <w:r>
+        <w:t xml:space="preserve"> on AWS, leveraging services such as EC2, S3,</w:t>
+      </w:r>
+      <w:r>
+        <w:t xml:space="preserve"> EKS</w:t>
+      </w:r>
+      <w:r>
+        <w:t xml:space="preserve"> and Lambda to ensure scalable performance and reliability for processing large biological datasets in a cloud-native environment.</w:t>
+      </w:r>
+    </w:p>
+    <w:p>
+      <w:pPr>
+        <w:spacing w:after="0" w:line="259" w:lineRule="auto"/>
+        <w:ind w:left="2127" w:hanging="2127"/>
+        <w:jc w:val="both"/>
+        <w:rPr>
+          <w:b/>
+        </w:rPr>
+      </w:pPr>
+      <w:r>
+        <w:rPr>
+          <w:b/>
+        </w:rPr>
+        <w:t>Associate Machine Learning Engineer</w:t>
+      </w:r>
+      <w:r>
+        <w:rPr>
+          <w:b/>
+        </w:rPr>
+        <w:t xml:space="preserve"> </w:t>
+      </w:r>
+      <w:r>
+        <w:rPr>
+          <w:bCs/>
+        </w:rPr>
+        <w:t>[</w:t>
+      </w:r>
+      <w:hyperlink r:id="rId16" w:history="1">
+        <w:r>
+          <w:rPr>
+            <w:rStyle w:val="Hyperlink"/>
+            <w:bCs/>
+          </w:rPr>
+          <w:t xml:space="preserve">ISPG Technologies </w:t>
+        </w:r>
+        <w:proofErr w:type="spellStart"/>
+        <w:r>
+          <w:rPr>
+            <w:rStyle w:val="Hyperlink"/>
+            <w:bCs/>
+          </w:rPr>
+          <w:t>Pvt.Ltd</w:t>
+        </w:r>
+        <w:proofErr w:type="spellEnd"/>
+        <w:r>
+          <w:rPr>
+            <w:rStyle w:val="Hyperlink"/>
+            <w:bCs/>
+          </w:rPr>
+          <w:t>, Kochin, Kerala</w:t>
+        </w:r>
+      </w:hyperlink>
+      <w:r>
+        <w:rPr>
+          <w:bCs/>
+        </w:rPr>
+        <w:t>]</w:t>
+      </w:r>
+      <w:r>
+        <w:rPr>
+          <w:b/>
+        </w:rPr>
+        <w:t xml:space="preserve">                             Dec 2024 – </w:t>
+      </w:r>
+      <w:r>
+        <w:rPr>
+          <w:b/>
+        </w:rPr>
+        <w:t>Mar 2025</w:t>
+      </w:r>
+    </w:p>
+    <w:p>
+      <w:pPr>
+        <w:spacing w:after="0" w:line="259" w:lineRule="auto"/>
+        <w:ind w:left="2127" w:hanging="2127"/>
+        <w:jc w:val="both"/>
+        <w:rPr>
+          <w:b/>
+          <w:bCs/>
+          <w:i/>
+          <w:iCs/>
+          <w:sz w:val="20"/>
+          <w:szCs w:val="20"/>
+        </w:rPr>
+      </w:pPr>
+      <w:r>
+        <w:rPr>
+          <w:b/>
+          <w:bCs/>
+          <w:i/>
+          <w:iCs/>
+          <w:sz w:val="20"/>
+          <w:szCs w:val="20"/>
+        </w:rPr>
+        <w:t>(Intern</w:t>
+      </w:r>
+      <w:r>
+        <w:rPr>
+          <w:b/>
+          <w:bCs/>
+          <w:i/>
+          <w:iCs/>
+          <w:sz w:val="20"/>
+          <w:szCs w:val="20"/>
+        </w:rPr>
+        <w:t>: 7 Months</w:t>
+      </w:r>
+      <w:r>
+        <w:rPr>
+          <w:b/>
+          <w:bCs/>
+          <w:i/>
+          <w:iCs/>
+          <w:sz w:val="20"/>
+          <w:szCs w:val="20"/>
+        </w:rPr>
+        <w:t xml:space="preserve"> → Associate ML Engineer</w:t>
+      </w:r>
+      <w:r>
+        <w:rPr>
+          <w:b/>
+          <w:bCs/>
+          <w:i/>
+          <w:iCs/>
+          <w:sz w:val="20"/>
+          <w:szCs w:val="20"/>
+        </w:rPr>
+        <w:t>: 3 Months</w:t>
+      </w:r>
+      <w:r>
+        <w:rPr>
+          <w:b/>
+          <w:bCs/>
+          <w:i/>
+          <w:iCs/>
+          <w:sz w:val="20"/>
+          <w:szCs w:val="20"/>
+        </w:rPr>
+        <w:t>)</w:t>
       </w:r>
     </w:p>
     <w:p>
@@ -762,10 +925,26 @@
           <w:b/>
           <w:bCs/>
         </w:rPr>
-        <w:t>AI Chatbot Workflow with LangGraph Agents &amp; AWS (Pre-Production):</w:t>
-      </w:r>
-      <w:r>
-        <w:t xml:space="preserve"> Developing a product with a structured workflow for an AI chatbot using LangGraph tools and agents, enabling efficient, task-specific interactions by automating responses and decision-making processes, improving user experience and achieving accuracy levels of over 70% compared to manual flow approaches. The solution features a centralized chatbot with an admin dashboard for controlling and customizing functionalities.</w:t>
+        <w:t>RAG-Based Product User-Manual Chatbot (Development)</w:t>
+      </w:r>
+      <w:r>
+        <w:t>: Created a RAG-based product manual chatbot API by crawling and scraping over 5000 websites using Selenium, stored embeddings in Mongo-</w:t>
+      </w:r>
+      <w:proofErr w:type="spellStart"/>
+      <w:r>
+        <w:t>VectorSearch</w:t>
+      </w:r>
+      <w:proofErr w:type="spellEnd"/>
+      <w:r>
+        <w:t xml:space="preserve">, and structured the workflow using </w:t>
+      </w:r>
+      <w:proofErr w:type="spellStart"/>
+      <w:r>
+        <w:t>LangGraph</w:t>
+      </w:r>
+      <w:proofErr w:type="spellEnd"/>
+      <w:r>
+        <w:t xml:space="preserve"> with tools and agents for particular sections.</w:t>
       </w:r>
     </w:p>
     <w:p>
@@ -783,10 +962,34 @@
           <w:b/>
           <w:bCs/>
         </w:rPr>
-        <w:t>RAG Technology Integration (Development):</w:t>
-      </w:r>
-      <w:r>
-        <w:t xml:space="preserve"> Developed and integrated Database Retrieval-Augmented Generation (RAG) into the CRM database, enabling seamless translation of user NLP queries into Cypher queries (Graph DB) and converting Cypher responses into human-readable formats. Implemented restricted delete, create, and update operations. This integration enhanced client interaction and operational efficiency by 40%.</w:t>
+        <w:t xml:space="preserve">AI Chatbot Workflow with </w:t>
+      </w:r>
+      <w:proofErr w:type="spellStart"/>
+      <w:r>
+        <w:rPr>
+          <w:b/>
+          <w:bCs/>
+        </w:rPr>
+        <w:t>LangGraph</w:t>
+      </w:r>
+      <w:proofErr w:type="spellEnd"/>
+      <w:r>
+        <w:rPr>
+          <w:b/>
+          <w:bCs/>
+        </w:rPr>
+        <w:t xml:space="preserve"> Agents &amp; AWS (Pre-Production):</w:t>
+      </w:r>
+      <w:r>
+        <w:t xml:space="preserve"> Developing a product with a structured workflow for an AI chatbot using </w:t>
+      </w:r>
+      <w:proofErr w:type="spellStart"/>
+      <w:r>
+        <w:t>LangGraph</w:t>
+      </w:r>
+      <w:proofErr w:type="spellEnd"/>
+      <w:r>
+        <w:t xml:space="preserve"> tools and agents, enabling efficient, task-specific interactions by automating responses and decision-making processes, improving user experience and achieving accuracy levels of over 70% compared to manual flow approaches. The solution features a centralized chatbot with an admin dashboard for controlling and customizing functionalities.</w:t>
       </w:r>
     </w:p>
     <w:p>
@@ -804,10 +1007,39 @@
           <w:b/>
           <w:bCs/>
         </w:rPr>
+        <w:t>RAG Technology Integration (Development):</w:t>
+      </w:r>
+      <w:r>
+        <w:t xml:space="preserve"> Developed and integrated Database Retrieval-Augmented Generation (RAG) into the CRM database, enabling seamless translation of user NLP queries into Cypher queries (Graph DB) and converting Cypher responses into human-readable formats. Implemented restricted delete, create, and update operations. This integration enhanced client interaction and operational efficiency by 40%.</w:t>
+      </w:r>
+    </w:p>
+    <w:p>
+      <w:pPr>
+        <w:numPr>
+          <w:ilvl w:val="0"/>
+          <w:numId w:val="5"/>
+        </w:numPr>
+        <w:spacing w:after="0"/>
+        <w:ind w:left="631" w:hanging="360"/>
+        <w:jc w:val="both"/>
+      </w:pPr>
+      <w:r>
+        <w:rPr>
+          <w:b/>
+          <w:bCs/>
+        </w:rPr>
         <w:t>AI-Based E-Commerce Query System (Production):</w:t>
       </w:r>
       <w:r>
-        <w:t xml:space="preserve"> Designed and developed two AI-based e-commerce query systems and an admin dashboard for cost and query analysis using MongoDB VectorSearch for automobile spare parts and jewelry retailers. Implemented AI-driven search systems that enhanced customer experience with fast, accurate queries and natural language processing by 200ms. Integrated advanced search and AI recommendations, improving user experience by </w:t>
+        <w:t xml:space="preserve"> Designed and developed two AI-based e-commerce query systems and an admin dashboard for cost and query analysis using MongoDB </w:t>
+      </w:r>
+      <w:proofErr w:type="spellStart"/>
+      <w:r>
+        <w:t>VectorSearch</w:t>
+      </w:r>
+      <w:proofErr w:type="spellEnd"/>
+      <w:r>
+        <w:t xml:space="preserve"> for automobile spare parts and jewelry retailers. Implemented AI-driven search systems that enhanced customer experience with fast, accurate queries and natural language processing by 200ms. Integrated advanced search and AI recommendations, improving user experience by </w:t>
       </w:r>
       <w:r>
         <w:t>5</w:t>
@@ -851,14 +1083,21 @@
         <w:rPr>
           <w:lang w:val="en-IN"/>
         </w:rPr>
-        <w:t>MK Labels, Chennai</w:t>
-      </w:r>
-      <w:r>
-        <w:rPr>
-          <w:b/>
-          <w:bCs/>
+        <w:t xml:space="preserve">MK Labels, </w:t>
+      </w:r>
+      <w:proofErr w:type="gramStart"/>
+      <w:r>
+        <w:rPr>
           <w:lang w:val="en-IN"/>
         </w:rPr>
+        <w:t>Chennai</w:t>
+      </w:r>
+      <w:r>
+        <w:rPr>
+          <w:b/>
+          <w:bCs/>
+          <w:lang w:val="en-IN"/>
+        </w:rPr>
         <w:t>]</w:t>
       </w:r>
       <w:r>
@@ -871,7 +1110,14 @@
         <w:rPr>
           <w:b/>
         </w:rPr>
-        <w:t xml:space="preserve">                                                                               May 2021 – Jul 2022</w:t>
+        <w:t xml:space="preserve">  </w:t>
+      </w:r>
+      <w:proofErr w:type="gramEnd"/>
+      <w:r>
+        <w:rPr>
+          <w:b/>
+        </w:rPr>
+        <w:t xml:space="preserve">                                                                             May 2021 – Jul 2022</w:t>
       </w:r>
     </w:p>
     <w:p>
@@ -1001,12 +1247,57 @@
           <w:bCs/>
         </w:rPr>
       </w:pPr>
+    </w:p>
+    <w:p>
+      <w:pPr>
+        <w:spacing w:after="0" w:line="259" w:lineRule="auto"/>
+        <w:ind w:left="0" w:firstLine="0"/>
+        <w:jc w:val="both"/>
+        <w:rPr>
+          <w:b/>
+          <w:bCs/>
+        </w:rPr>
+      </w:pPr>
+    </w:p>
+    <w:p>
+      <w:pPr>
+        <w:spacing w:after="0" w:line="259" w:lineRule="auto"/>
+        <w:ind w:left="0" w:firstLine="0"/>
+        <w:jc w:val="both"/>
+        <w:rPr>
+          <w:b/>
+          <w:bCs/>
+        </w:rPr>
+      </w:pPr>
+    </w:p>
+    <w:p>
+      <w:pPr>
+        <w:spacing w:after="0" w:line="259" w:lineRule="auto"/>
+        <w:ind w:left="0" w:firstLine="0"/>
+        <w:jc w:val="both"/>
+        <w:rPr>
+          <w:b/>
+          <w:bCs/>
+        </w:rPr>
+      </w:pPr>
+    </w:p>
+    <w:p>
+      <w:pPr>
+        <w:spacing w:after="0" w:line="259" w:lineRule="auto"/>
+        <w:ind w:left="0" w:firstLine="0"/>
+        <w:jc w:val="both"/>
+        <w:rPr>
+          <w:b/>
+          <w:bCs/>
+        </w:rPr>
+      </w:pPr>
       <w:r>
         <w:rPr>
           <w:b/>
           <w:bCs/>
           <w:noProof/>
         </w:rPr>
+        <w:lastRenderedPageBreak/>
         <mc:AlternateContent>
           <mc:Choice Requires="wpi">
             <w:drawing>
@@ -1025,7 +1316,7 @@
                 <wp:cNvGraphicFramePr/>
                 <a:graphic xmlns:a="http://schemas.openxmlformats.org/drawingml/2006/main">
                   <a:graphicData uri="http://schemas.microsoft.com/office/word/2010/wordprocessingInk">
-                    <w14:contentPart bwMode="auto" r:id="rId18">
+                    <w14:contentPart bwMode="auto" r:id="rId17">
                       <w14:nvContentPartPr>
                         <w14:cNvContentPartPr/>
                       </w14:nvContentPartPr>
@@ -1081,11 +1372,19 @@
         <w:ind w:left="-5"/>
         <w:jc w:val="both"/>
       </w:pPr>
-      <w:r>
-        <w:rPr>
-          <w:b/>
-        </w:rPr>
-        <w:t xml:space="preserve">Bharathiar University, </w:t>
+      <w:proofErr w:type="spellStart"/>
+      <w:r>
+        <w:rPr>
+          <w:b/>
+        </w:rPr>
+        <w:t>Bharathiar</w:t>
+      </w:r>
+      <w:proofErr w:type="spellEnd"/>
+      <w:r>
+        <w:rPr>
+          <w:b/>
+        </w:rPr>
+        <w:t xml:space="preserve"> University, </w:t>
       </w:r>
       <w:r>
         <w:rPr>
@@ -1373,7 +1672,6 @@
         <w:rPr>
           <w:noProof/>
         </w:rPr>
-        <w:lastRenderedPageBreak/>
         <mc:AlternateContent>
           <mc:Choice Requires="wpi">
             <w:drawing>
@@ -1444,13 +1742,42 @@
         <w:t xml:space="preserve">                        </w:t>
       </w:r>
       <w:r>
-        <w:t>Python (Numpy, Pandas, Matplotlib, Seaborn, Scikit-Learn, Tensorflow, Keras, NLTK</w:t>
-      </w:r>
-      <w:r>
-        <w:t>, Streamlit</w:t>
-      </w:r>
-      <w:r>
-        <w:t xml:space="preserve">), </w:t>
+        <w:t>Python (</w:t>
+      </w:r>
+      <w:proofErr w:type="spellStart"/>
+      <w:r>
+        <w:t>Numpy</w:t>
+      </w:r>
+      <w:proofErr w:type="spellEnd"/>
+      <w:r>
+        <w:t xml:space="preserve">, Pandas, Matplotlib, Seaborn, Scikit-Learn, </w:t>
+      </w:r>
+      <w:proofErr w:type="spellStart"/>
+      <w:r>
+        <w:t>Tensorflow</w:t>
+      </w:r>
+      <w:proofErr w:type="spellEnd"/>
+      <w:r>
+        <w:t xml:space="preserve">, </w:t>
+      </w:r>
+      <w:proofErr w:type="spellStart"/>
+      <w:r>
+        <w:t>Keras</w:t>
+      </w:r>
+      <w:proofErr w:type="spellEnd"/>
+      <w:r>
+        <w:t>, NLTK</w:t>
+      </w:r>
+      <w:r>
+        <w:t xml:space="preserve">, </w:t>
+      </w:r>
+      <w:proofErr w:type="spellStart"/>
+      <w:r>
+        <w:t>Streamlit</w:t>
+      </w:r>
+      <w:proofErr w:type="spellEnd"/>
+      <w:r>
+        <w:t xml:space="preserve">, </w:t>
       </w:r>
     </w:p>
     <w:p>
@@ -1465,8 +1792,21 @@
         <w:t xml:space="preserve"> </w:t>
       </w:r>
       <w:r>
-        <w:t>Fast-API, Flask, Langchain, Langgraph</w:t>
-      </w:r>
+        <w:t xml:space="preserve">Fast-API, Flask, </w:t>
+      </w:r>
+      <w:proofErr w:type="spellStart"/>
+      <w:r>
+        <w:t>Langchain</w:t>
+      </w:r>
+      <w:proofErr w:type="spellEnd"/>
+      <w:r>
+        <w:t xml:space="preserve">, </w:t>
+      </w:r>
+      <w:proofErr w:type="spellStart"/>
+      <w:r>
+        <w:t>Langgraph</w:t>
+      </w:r>
+      <w:proofErr w:type="spellEnd"/>
       <w:r>
         <w:t>, Neo4j</w:t>
       </w:r>
@@ -1503,77 +1843,10 @@
         <w:t>,</w:t>
       </w:r>
       <w:r>
-        <w:t xml:space="preserve"> R (Fundamentals</w:t>
-      </w:r>
-      <w:r>
-        <w:t>),</w:t>
-      </w:r>
-      <w:r>
-        <w:t xml:space="preserve"> SQL </w:t>
+        <w:t xml:space="preserve"> SQL</w:t>
       </w:r>
       <w:r>
         <w:t>, Cypher (Neo4J)</w:t>
-      </w:r>
-    </w:p>
-    <w:p>
-      <w:pPr>
-        <w:ind w:left="1985" w:hanging="1985"/>
-        <w:jc w:val="both"/>
-      </w:pPr>
-      <w:r>
-        <w:rPr>
-          <w:b/>
-          <w:i/>
-        </w:rPr>
-        <w:t>Data Wranglin</w:t>
-      </w:r>
-      <w:r>
-        <w:rPr>
-          <w:b/>
-          <w:i/>
-        </w:rPr>
-        <w:t>g</w:t>
-      </w:r>
-      <w:r>
-        <w:rPr>
-          <w:b/>
-          <w:i/>
-        </w:rPr>
-        <w:t xml:space="preserve"> </w:t>
-      </w:r>
-      <w:r>
-        <w:rPr>
-          <w:b/>
-          <w:i/>
-        </w:rPr>
-        <w:t xml:space="preserve">   </w:t>
-      </w:r>
-      <w:r>
-        <w:t xml:space="preserve">Data Preparation, Data Extraction, Data Cleaning, Exploratory Data Analysis(EDA), Data </w:t>
-      </w:r>
-      <w:r>
-        <w:t xml:space="preserve">           </w:t>
-      </w:r>
-      <w:r>
-        <w:t>Visualization,</w:t>
-      </w:r>
-      <w:r>
-        <w:t xml:space="preserve"> </w:t>
-      </w:r>
-      <w:r>
-        <w:t>Feature Engineering,Feature selection, Model Building, IoT</w:t>
-      </w:r>
-      <w:r>
-        <w:rPr>
-          <w:i/>
-        </w:rPr>
-        <w:t xml:space="preserve"> </w:t>
-      </w:r>
-      <w:r>
-        <w:rPr>
-          <w:i/>
-        </w:rPr>
-        <w:t>.</w:t>
       </w:r>
     </w:p>
     <w:p>
@@ -1667,17 +1940,19 @@
       <w:r>
         <w:t xml:space="preserve">                              </w:t>
       </w:r>
-      <w:r>
-        <w:t>Jupyter Notebook, Arduino IDE, MS Excel, Tableau, VS code</w:t>
+      <w:proofErr w:type="spellStart"/>
+      <w:r>
+        <w:t>Jupyter</w:t>
+      </w:r>
+      <w:proofErr w:type="spellEnd"/>
+      <w:r>
+        <w:t xml:space="preserve"> Notebook, Arduino IDE, MS Excel, Tableau, VS code</w:t>
       </w:r>
       <w:r>
         <w:t>, Postman</w:t>
       </w:r>
       <w:r>
         <w:t>, n8n</w:t>
-      </w:r>
-      <w:r>
-        <w:t>, Github Actions</w:t>
       </w:r>
       <w:r>
         <w:t>.</w:t>
@@ -1716,23 +1991,24 @@
         </w:rPr>
         <w:t xml:space="preserve"> </w:t>
       </w:r>
-      <w:r>
-        <w:t>Fundamental</w:t>
-      </w:r>
-      <w:r>
-        <w:t>s (</w:t>
-      </w:r>
-      <w:r>
-        <w:t>Hive</w:t>
-      </w:r>
-      <w:r>
-        <w:t xml:space="preserve">) </w:t>
-      </w:r>
-      <w:r>
-        <w:t>, Langchain, LLM, Large Language Models, IoT</w:t>
-      </w:r>
-      <w:r>
-        <w:t>, Onnx, Docker, Kubernetes</w:t>
+      <w:proofErr w:type="spellStart"/>
+      <w:r>
+        <w:t>Langchain</w:t>
+      </w:r>
+      <w:proofErr w:type="spellEnd"/>
+      <w:r>
+        <w:t>, LLM, Large Language Models, IoT</w:t>
+      </w:r>
+      <w:r>
+        <w:t xml:space="preserve">, </w:t>
+      </w:r>
+      <w:proofErr w:type="spellStart"/>
+      <w:r>
+        <w:t>Onnx</w:t>
+      </w:r>
+      <w:proofErr w:type="spellEnd"/>
+      <w:r>
+        <w:t>, Docker, Kubernetes</w:t>
       </w:r>
       <w:r>
         <w:t>.</w:t>
@@ -1741,18 +2017,14 @@
     <w:p>
       <w:pPr>
         <w:spacing w:after="0" w:line="259" w:lineRule="auto"/>
-        <w:ind w:left="2127" w:hanging="2127"/>
+        <w:ind w:left="1985" w:hanging="1985"/>
         <w:jc w:val="both"/>
-      </w:pPr>
-      <w:r>
-        <w:rPr>
-          <w:b/>
-          <w:bCs/>
+        <w:rPr>
           <w:i/>
           <w:iCs/>
         </w:rPr>
-        <w:t>Cloud</w:t>
-      </w:r>
+      </w:pPr>
+      <w:proofErr w:type="spellStart"/>
       <w:r>
         <w:rPr>
           <w:b/>
@@ -1760,8 +2032,9 @@
           <w:i/>
           <w:iCs/>
         </w:rPr>
-        <w:t xml:space="preserve">           </w:t>
-      </w:r>
+        <w:t>Pipleines</w:t>
+      </w:r>
+      <w:proofErr w:type="spellEnd"/>
       <w:r>
         <w:rPr>
           <w:b/>
@@ -1771,31 +2044,136 @@
         </w:rPr>
         <w:tab/>
       </w:r>
-      <w:r>
-        <w:t xml:space="preserve">AWS EC2, AWS IAM, AWS Beanstalk, AWS Bedrock, AWS RDS,  </w:t>
-      </w:r>
-      <w:r>
-        <w:t>AWS Sagemaker</w:t>
-      </w:r>
-      <w:r>
-        <w:t xml:space="preserve"> (Fundamentals)</w:t>
-      </w:r>
-      <w:r>
-        <w:t>, AWS APIGateway, AWS Lambda, AWS S3</w:t>
-      </w:r>
-      <w:r>
-        <w:t>, AWS ECR</w:t>
+      <w:proofErr w:type="spellStart"/>
+      <w:r>
+        <w:t>Kedro</w:t>
+      </w:r>
+      <w:proofErr w:type="spellEnd"/>
+      <w:r>
+        <w:t xml:space="preserve"> </w:t>
+      </w:r>
+      <w:r>
+        <w:t>Pipelines</w:t>
+      </w:r>
+      <w:r>
+        <w:t xml:space="preserve">, </w:t>
+      </w:r>
+      <w:proofErr w:type="spellStart"/>
+      <w:r>
+        <w:t>Github</w:t>
+      </w:r>
+      <w:proofErr w:type="spellEnd"/>
+      <w:r>
+        <w:t xml:space="preserve"> actions </w:t>
+      </w:r>
+      <w:r>
+        <w:t>Pipelines</w:t>
+      </w:r>
+      <w:r>
+        <w:t xml:space="preserve">, Kubeflow </w:t>
+      </w:r>
+      <w:r>
+        <w:t>Pipelines</w:t>
+      </w:r>
+      <w:r>
+        <w:t xml:space="preserve">, </w:t>
+      </w:r>
+      <w:proofErr w:type="spellStart"/>
+      <w:r>
+        <w:t>S</w:t>
+      </w:r>
+      <w:r>
+        <w:t>agemaker</w:t>
+      </w:r>
+      <w:proofErr w:type="spellEnd"/>
+      <w:r>
+        <w:t xml:space="preserve"> Pipelines</w:t>
+      </w:r>
+    </w:p>
+    <w:p>
+      <w:pPr>
+        <w:spacing w:after="0" w:line="259" w:lineRule="auto"/>
+        <w:ind w:left="0" w:firstLine="0"/>
+        <w:jc w:val="both"/>
+      </w:pPr>
+      <w:r>
+        <w:rPr>
+          <w:b/>
+          <w:bCs/>
+          <w:i/>
+          <w:iCs/>
+        </w:rPr>
+        <w:t>Cloud</w:t>
+      </w:r>
+      <w:r>
+        <w:rPr>
+          <w:b/>
+          <w:bCs/>
+          <w:i/>
+          <w:iCs/>
+        </w:rPr>
+        <w:t xml:space="preserve">                             Amazon Web Service </w:t>
+      </w:r>
+      <w:r>
+        <w:rPr>
+          <w:b/>
+          <w:bCs/>
+          <w:i/>
+          <w:iCs/>
+        </w:rPr>
+        <w:t>(</w:t>
+      </w:r>
+      <w:r>
+        <w:t xml:space="preserve">AWS EC2, AWS IAM AWS Bedrock, AWS RDS, AWS </w:t>
+      </w:r>
+      <w:proofErr w:type="spellStart"/>
+      <w:r>
+        <w:t>APIGateway</w:t>
+      </w:r>
+      <w:proofErr w:type="spellEnd"/>
+      <w:r>
+        <w:t>,</w:t>
+      </w:r>
+    </w:p>
+    <w:p>
+      <w:pPr>
+        <w:spacing w:after="0" w:line="259" w:lineRule="auto"/>
+        <w:ind w:left="0" w:firstLine="0"/>
+        <w:jc w:val="both"/>
+      </w:pPr>
+      <w:r>
+        <w:t xml:space="preserve">                                      </w:t>
+      </w:r>
+      <w:r>
+        <w:t xml:space="preserve">AWS </w:t>
+      </w:r>
+      <w:proofErr w:type="spellStart"/>
+      <w:r>
+        <w:t>Sagemaker</w:t>
+      </w:r>
+      <w:proofErr w:type="spellEnd"/>
+      <w:r>
+        <w:t xml:space="preserve"> (Fundamentals), AWS Lambda, AWS S3, AWS ECR</w:t>
+      </w:r>
+      <w:r>
+        <w:t>)</w:t>
       </w:r>
       <w:r>
         <w:t>, GCP</w:t>
       </w:r>
-    </w:p>
-    <w:p>
-      <w:pPr>
-        <w:spacing w:after="0" w:line="259" w:lineRule="auto"/>
-        <w:ind w:left="2127" w:hanging="2127"/>
-        <w:jc w:val="both"/>
-      </w:pPr>
+      <w:r>
+        <w:t xml:space="preserve"> (</w:t>
+      </w:r>
+      <w:r>
+        <w:rPr>
+          <w:b/>
+          <w:bCs/>
+        </w:rPr>
+        <w:t>Google Cloud Platform</w:t>
+      </w:r>
+      <w:r>
+        <w:t>)</w:t>
+      </w:r>
     </w:p>
     <w:p>
       <w:pPr>
@@ -1866,11 +2244,19 @@
       <w:pPr>
         <w:jc w:val="both"/>
       </w:pPr>
-      <w:r>
-        <w:rPr>
-          <w:b/>
-        </w:rPr>
-        <w:t xml:space="preserve">Omnibot - </w:t>
+      <w:proofErr w:type="spellStart"/>
+      <w:r>
+        <w:rPr>
+          <w:b/>
+        </w:rPr>
+        <w:t>Omnibot</w:t>
+      </w:r>
+      <w:proofErr w:type="spellEnd"/>
+      <w:r>
+        <w:rPr>
+          <w:b/>
+        </w:rPr>
+        <w:t xml:space="preserve"> - </w:t>
       </w:r>
       <w:r>
         <w:rPr>
@@ -1885,7 +2271,15 @@
         <w:t xml:space="preserve">, </w:t>
       </w:r>
       <w:r>
-        <w:t>[Langchain, LLM, Genai, Word Embeddings] [</w:t>
+        <w:t>[</w:t>
+      </w:r>
+      <w:proofErr w:type="spellStart"/>
+      <w:r>
+        <w:t>Langchain</w:t>
+      </w:r>
+      <w:proofErr w:type="spellEnd"/>
+      <w:r>
+        <w:t>, LLM, Genai, Word Embeddings] [</w:t>
       </w:r>
       <w:hyperlink r:id="rId24" w:history="1">
         <w:r>
@@ -1978,7 +2372,23 @@
         <w:jc w:val="both"/>
       </w:pPr>
       <w:r>
-        <w:t>Implemented Faiss document retrieval from Meta for efficient text data extraction, prioritizing speed and enabling rapid nearest neighbor search and clustering operations. Furthermore, integrated advanced language models such as GEMMA and Gemini with Faiss to ensure superior performance and accuracy in data processing tasks.</w:t>
+        <w:t xml:space="preserve">Implemented </w:t>
+      </w:r>
+      <w:proofErr w:type="spellStart"/>
+      <w:r>
+        <w:t>Faiss</w:t>
+      </w:r>
+      <w:proofErr w:type="spellEnd"/>
+      <w:r>
+        <w:t xml:space="preserve"> document retrieval from Meta for efficient text data extraction, prioritizing speed and enabling rapid nearest neighbor search and clustering operations. Furthermore, integrated advanced language models such as GEMMA and Gemini with </w:t>
+      </w:r>
+      <w:proofErr w:type="spellStart"/>
+      <w:r>
+        <w:t>Faiss</w:t>
+      </w:r>
+      <w:proofErr w:type="spellEnd"/>
+      <w:r>
+        <w:t xml:space="preserve"> to ensure superior performance and accuracy in data processing tasks.</w:t>
       </w:r>
     </w:p>
     <w:p>
@@ -2049,7 +2459,23 @@
         <w:jc w:val="both"/>
       </w:pPr>
       <w:r>
-        <w:t>Implemented XLMBert, a variant of the BERT architecture, using the Keras NLP framework for natural language processing tasks, capable of handling more than 100,000 instances.</w:t>
+        <w:t xml:space="preserve">Implemented </w:t>
+      </w:r>
+      <w:proofErr w:type="spellStart"/>
+      <w:r>
+        <w:t>XLMBert</w:t>
+      </w:r>
+      <w:proofErr w:type="spellEnd"/>
+      <w:r>
+        <w:t xml:space="preserve">, a variant of the BERT architecture, using the </w:t>
+      </w:r>
+      <w:proofErr w:type="spellStart"/>
+      <w:r>
+        <w:t>Keras</w:t>
+      </w:r>
+      <w:proofErr w:type="spellEnd"/>
+      <w:r>
+        <w:t xml:space="preserve"> NLP framework for natural language processing tasks, capable of handling more than 100,000 instances.</w:t>
       </w:r>
     </w:p>
     <w:p>
@@ -2074,7 +2500,15 @@
         <w:t xml:space="preserve"> </w:t>
       </w:r>
       <w:r>
-        <w:t>using a custom classification dataset, employing techniques such as stopword removal and word embeddings for preprocessing.</w:t>
+        <w:t xml:space="preserve">using a custom classification dataset, employing techniques such as </w:t>
+      </w:r>
+      <w:proofErr w:type="spellStart"/>
+      <w:r>
+        <w:t>stopword</w:t>
+      </w:r>
+      <w:proofErr w:type="spellEnd"/>
+      <w:r>
+        <w:t xml:space="preserve"> removal and word embeddings for preprocessing.</w:t>
       </w:r>
     </w:p>
     <w:p>
@@ -2156,8 +2590,16 @@
         <w:rPr>
           <w:b w:val="0"/>
         </w:rPr>
-        <w:t xml:space="preserve"> [Deep Learning, CNN, Image Processing][</w:t>
-      </w:r>
+        <w:t xml:space="preserve"> [Deep Learning, CNN, Image </w:t>
+      </w:r>
+      <w:proofErr w:type="gramStart"/>
+      <w:r>
+        <w:rPr>
+          <w:b w:val="0"/>
+        </w:rPr>
+        <w:t>Processing][</w:t>
+      </w:r>
+      <w:proofErr w:type="gramEnd"/>
       <w:hyperlink r:id="rId28" w:history="1">
         <w:r>
           <w:rPr>
@@ -2363,7 +2805,15 @@
         <w:jc w:val="both"/>
       </w:pPr>
       <w:r>
-        <w:t>Developed a Streamlit environment for interactive deployment, facilitating easy input of images and immediate visualization of enhanced outputs. This streamlined workflow led to a 14% improvement in real-time predictions.</w:t>
+        <w:t xml:space="preserve">Developed a </w:t>
+      </w:r>
+      <w:proofErr w:type="spellStart"/>
+      <w:r>
+        <w:t>Streamlit</w:t>
+      </w:r>
+      <w:proofErr w:type="spellEnd"/>
+      <w:r>
+        <w:t xml:space="preserve"> environment for interactive deployment, facilitating easy input of images and immediate visualization of enhanced outputs. This streamlined workflow led to a 14% improvement in real-time predictions.</w:t>
       </w:r>
     </w:p>
     <w:p>
@@ -2377,7 +2827,15 @@
         <w:jc w:val="both"/>
       </w:pPr>
       <w:r>
-        <w:t>The FSRCNN model with PReLU activation performs better compared to bicubic and ReLU by 20% and 2%, respectively.</w:t>
+        <w:t xml:space="preserve">The FSRCNN model with PReLU activation performs better compared to bicubic and </w:t>
+      </w:r>
+      <w:proofErr w:type="spellStart"/>
+      <w:r>
+        <w:t>ReLU</w:t>
+      </w:r>
+      <w:proofErr w:type="spellEnd"/>
+      <w:r>
+        <w:t xml:space="preserve"> by 20% and 2%, respectively.</w:t>
       </w:r>
     </w:p>
     <w:p>
@@ -4885,7 +5343,6 @@
   <w:style w:type="character" w:default="1" w:styleId="DefaultParagraphFont">
     <w:name w:val="Default Paragraph Font"/>
     <w:uiPriority w:val="1"/>
-    <w:semiHidden/>
     <w:unhideWhenUsed/>
   </w:style>
   <w:style w:type="table" w:default="1" w:styleId="TableNormal">

</xml_diff>